<commit_message>
Survey 2: neutral, impersonal wording in data notes, summaries, generated lists and READMEs
</commit_message>
<xml_diff>
--- a/github/m/Survey2_AIR_Online_Resource_1.docx
+++ b/github/m/Survey2_AIR_Online_Resource_1.docx
@@ -1461,7 +1461,7 @@
               <w:jc w:val="left"/>
             </w:pPr>
             <w:r>
-              <w:t xml:space="preserve">Reported competitive or improved retrieval over MRF-style dependency models (numbers not verified here)</w:t>
+              <w:t xml:space="preserve">Reported competitive or improved retrieval over MRF-style dependency models (figures not extracted; abstract only)</w:t>
             </w:r>
           </w:p>
         </w:tc>
@@ -1853,7 +1853,7 @@
               <w:jc w:val="left"/>
             </w:pPr>
             <w:r>
-              <w:t xml:space="preserve">Reported effective against neural and quantum LM baselines (numbers not verified)</w:t>
+              <w:t xml:space="preserve">Reported effective against neural and quantum LM baselines (figures not extracted; abstract only)</w:t>
             </w:r>
           </w:p>
         </w:tc>
@@ -2049,7 +2049,7 @@
               <w:jc w:val="left"/>
             </w:pPr>
             <w:r>
-              <w:t xml:space="preserve">Reported competitive with state-of-the-art fusion plus interpretability (numbers not verified)</w:t>
+              <w:t xml:space="preserve">Reported competitive with state-of-the-art fusion plus interpretability (figures not extracted; abstract only)</w:t>
             </w:r>
           </w:p>
         </w:tc>
@@ -2441,19 +2441,19 @@
               <w:jc w:val="left"/>
             </w:pPr>
             <w:r>
-              <w:t xml:space="preserve">Reported improved/competitive matching (not verified)</w:t>
-            </w:r>
-          </w:p>
-        </w:tc>
-        <w:tc>
-          <w:tcPr/>
-          <w:p>
-            <w:pPr>
-              <w:pStyle w:val="Compact"/>
-              <w:jc w:val="left"/>
-            </w:pPr>
-            <w:r>
-              <w:t xml:space="preserve">Details unverified; density-matrix cost; interpretability not user-tested</w:t>
+              <w:t xml:space="preserve">Reported improved/competitive matching (details not extracted; abstract only)</w:t>
+            </w:r>
+          </w:p>
+        </w:tc>
+        <w:tc>
+          <w:tcPr/>
+          <w:p>
+            <w:pPr>
+              <w:pStyle w:val="Compact"/>
+              <w:jc w:val="left"/>
+            </w:pPr>
+            <w:r>
+              <w:t xml:space="preserve">Details not extracted (abstract only); density-matrix cost; interpretability not user-tested</w:t>
             </w:r>
           </w:p>
         </w:tc>
@@ -2551,7 +2551,7 @@
               <w:jc w:val="left"/>
             </w:pPr>
             <w:r>
-              <w:t xml:space="preserve">Human-likeness assessed via simulations, not participant data; datasets unverified</w:t>
+              <w:t xml:space="preserve">Human-likeness assessed via simulations, not participant data; datasets not extracted (abstract only)</w:t>
             </w:r>
           </w:p>
         </w:tc>
@@ -2845,7 +2845,7 @@
               <w:jc w:val="left"/>
             </w:pPr>
             <w:r>
-              <w:t xml:space="preserve">Single proprietary LLM; personas as proxies; numbers to verify</w:t>
+              <w:t xml:space="preserve">Single proprietary LLM; personas as proxies; numbers to be checked against the full text</w:t>
             </w:r>
           </w:p>
         </w:tc>
@@ -3436,7 +3436,7 @@
               <w:jc w:val="left"/>
             </w:pPr>
             <w:r>
-              <w:t xml:space="preserve">Classical heuristic only; evaluation on game benchmarks; exact gains not verified here</w:t>
+              <w:t xml:space="preserve">Classical heuristic only; evaluation on game benchmarks; exact gains not extracted (abstract only)</w:t>
             </w:r>
           </w:p>
         </w:tc>
@@ -4306,7 +4306,7 @@
               <w:jc w:val="left"/>
             </w:pPr>
             <w:r>
-              <w:t xml:space="preserve">Circuit schemes for generating and transitioning among Plutchik emotions (details not verified)</w:t>
+              <w:t xml:space="preserve">Circuit schemes for generating and transitioning among Plutchik emotions (details not extracted)</w:t>
             </w:r>
           </w:p>
         </w:tc>
@@ -4514,7 +4514,7 @@
               <w:jc w:val="left"/>
             </w:pPr>
             <w:r>
-              <w:t xml:space="preserve">Narrow scenario; interference parameters not clearly learned; quantitative details not verified here</w:t>
+              <w:t xml:space="preserve">Narrow scenario; interference parameters not clearly learned; quantitative details not extracted (abstract only)</w:t>
             </w:r>
           </w:p>
         </w:tc>
@@ -23599,7 +23599,7 @@
         <w:t xml:space="preserve">(Briegel and De las Cuevas 2012)</w:t>
       </w:r>
       <w:r>
-        <w:t xml:space="preserve">) serves as the learning mechanism, both for choosing which haptic sensing action to use and for choosing the preparatory skill given the perceived state. The approach is evaluated on a dual-arm robot in pick-and-place scenarios, notably grasping a book that may lie in different orientations and placing objects into a closed box, where the robot learned to use a flipping skill to open the lid. According to the paper (read via a web summary), sensing by sliding was far more reliable than poking or pressing, and roughly 80 roll-outs sufficed to reach 90% success in simulation based on real success rates. The state and skill sets are small and hand-designed and the learning is classical. It is an early demonstration of a quantum-compatible learning model (projective simulation) controlling a physical robot, later extended in</w:t>
+        <w:t xml:space="preserve">) serves as the learning mechanism, both for choosing which haptic sensing action to use and for choosing the preparatory skill given the perceived state. The approach is evaluated on a dual-arm robot in pick-and-place scenarios, notably grasping a book that may lie in different orientations and placing objects into a closed box, where the robot learned to use a flipping skill to open the lid. The authors report that sensing by sliding was far more reliable than poking or pressing, and roughly 80 roll-outs sufficed to reach 90% success in simulation based on real success rates. The state and skill sets are small and hand-designed and the learning is classical. It is an early demonstration of a quantum-compatible learning model (projective simulation) controlling a physical robot, later extended in</w:t>
       </w:r>
       <w:r>
         <w:t xml:space="preserve"> </w:t>
@@ -23893,7 +23893,7 @@
         <w:t xml:space="preserve"> </w:t>
       </w:r>
       <w:r>
-        <w:t xml:space="preserve">attempt a quantum-computational construction of robot affect intended to handle ambiguous emotional states, probabilistic decisions and parallel cognitive processes in human–robot interaction. Their Quantum Coppélia (Q-Coppélia) translates the fuzzy-logic Silicon Coppélia model, which simulates how a robot’s attitude towards its user develops, into quantum logic. Psychological scales are represented as qubits, so that superposition captures indefinite affective states and controlled operations and entanglement capture coexisting, ambivalent appraisals; the framework covers feature encoding, relevance and valence appraisal, use intentions and the trade-off between involvement and distance. The paper presents the full circuitry of the framework and argues that it relates quantum algorithms to (neuro)psychological processes. As far as the abstract and article summary indicate, there is no empirical validation: no human data, no run on a robot, and no comparison with the original fuzzy system or a classical probabilistic model, and whether circuits were executed on a simulator or hardware is not clear. The contribution is therefore a formal design showing how an existing affective architecture for social robots could be mapped onto gate-based quantum computation. It is relevant to the survey as the most complete quantum rendering of an established robot-affect model.</w:t>
+        <w:t xml:space="preserve">attempt a quantum-computational construction of robot affect intended to handle ambiguous emotional states, probabilistic decisions and parallel cognitive processes in human–robot interaction. Their Quantum Coppélia (Q-Coppélia) translates the fuzzy-logic Silicon Coppélia model, which simulates how a robot’s attitude towards its user develops, into quantum logic. Psychological scales are represented as qubits, so that superposition captures indefinite affective states and controlled operations and entanglement capture coexisting, ambivalent appraisals; the framework covers feature encoding, relevance and valence appraisal, use intentions and the trade-off between involvement and distance. The paper presents the full circuitry of the framework and argues that it relates quantum algorithms to (neuro)psychological processes. The paper reports no empirical validation: no human data, no run on a robot, and no comparison with the original fuzzy system or a classical probabilistic model, and whether circuits were executed on a simulator or hardware is not clear. The contribution is therefore a formal design showing how an existing affective architecture for social robots could be mapped onto gate-based quantum computation. It is relevant to the survey as the most complete quantum rendering of an established robot-affect model.</w:t>
       </w:r>
     </w:p>
     <w:bookmarkEnd w:id="77"/>
@@ -24019,7 +24019,7 @@
         <w:t xml:space="preserve"> </w:t>
       </w:r>
       <w:r>
-        <w:t xml:space="preserve">adopt the D’Ariano–Faggin view, in which thinking and consciousness are described by quantum-state dynamics and mental complexity by entanglement of ’qualia’ states, and use it to model a robot’s inner processing as a quantum–classical dialogue. Their case study is improvised robot dance: classical, periodic multisensory stimuli (visual and auditory, each encoded as calm or activating) are fed into a small quantum circuit representing the dancer’s inner state, and measurement outcomes are mapped to a repertoire of poses. According to the article summary, the circuit uses three qubits with controlled-Hadamard and Toffoli gates and is run on the IBM Qiskit simulator; a second case study adds environmental feedback so that repeated cycles produce increasingly unpredictable sequences, which the authors interpret as creativity, and one run shows reduced activity when an excited state is stimulated further, read as sensory overload. The results are preliminary and illustrative: initial states are set by hand, stimuli are binary, and there is no evaluation of the resulting behaviour by observers or comparison with a classical stochastic controller. The paper is relevant as an example of quantum circuits used as a generative ’inner state’ for expressive robot behaviour rather than as an optimiser.</w:t>
+        <w:t xml:space="preserve">adopt the D’Ariano–Faggin view, in which thinking and consciousness are described by quantum-state dynamics and mental complexity by entanglement of ’qualia’ states, and use it to model a robot’s inner processing as a quantum–classical dialogue. Their case study is improvised robot dance: classical, periodic multisensory stimuli (visual and auditory, each encoded as calm or activating) are fed into a small quantum circuit representing the dancer’s inner state, and measurement outcomes are mapped to a repertoire of poses. The authors report that the circuit uses three qubits with controlled-Hadamard and Toffoli gates and is run on the IBM Qiskit simulator; a second case study adds environmental feedback so that repeated cycles produce increasingly unpredictable sequences, which the authors interpret as creativity, and one run shows reduced activity when an excited state is stimulated further, read as sensory overload. The results are preliminary and illustrative: initial states are set by hand, stimuli are binary, and there is no evaluation of the resulting behaviour by observers or comparison with a classical stochastic controller. The paper is relevant as an example of quantum circuits used as a generative ’inner state’ for expressive robot behaviour rather than as an optimiser.</w:t>
       </w:r>
     </w:p>
     <w:bookmarkEnd w:id="80"/>
@@ -24157,7 +24157,7 @@
         <w:t xml:space="preserve"> </w:t>
       </w:r>
       <w:r>
-        <w:t xml:space="preserve">propose a hybrid classical–quantum architecture for a teleo-reactive robot, i.e. an agent that must classify its perceived situation and select an action under uncertainty arising from sensor noise, ambiguous perceptual configurations or poorly separable action regions. A classical sensor vector is mapped into a quantum feature space in which learned concepts or rule-defined perceptual regions are stored as reference states, and similarities between the current perception and these references support action selection. Two implementations are evaluated offline on a public wall-following robot dataset: a quantum-kernel classifier using ZZ feature maps with a support-vector classifier, compared with a classical RBF kernel, and an illustrative circuit that encodes sensor conditions directly into qubits and selects actions by measurement after amplitude amplification. According to the article summary, configurations with two sensors performed better than four, and the circuit reached an accuracy of about 0.91 on the two-sensor test set, with errors concentrated near boundaries between action regions. The authors state explicitly that this is an offline proxy for reactive control, not a closed-loop controller and not evidence of quantum advantage. The paper extends the group’s earlier quantum planner (</w:t>
+        <w:t xml:space="preserve">propose a hybrid classical–quantum architecture for a teleo-reactive robot, i.e. an agent that must classify its perceived situation and select an action under uncertainty arising from sensor noise, ambiguous perceptual configurations or poorly separable action regions. A classical sensor vector is mapped into a quantum feature space in which learned concepts or rule-defined perceptual regions are stored as reference states, and similarities between the current perception and these references support action selection. Two implementations are evaluated offline on a public wall-following robot dataset: a quantum-kernel classifier using ZZ feature maps with a support-vector classifier, compared with a classical RBF kernel, and an illustrative circuit that encodes sensor conditions directly into qubits and selects actions by measurement after amplitude amplification. The authors report that configurations with two sensors performed better than four, and the circuit reached an accuracy of about 0.91 on the two-sensor test set, with errors concentrated near boundaries between action regions. The authors state explicitly that this is an offline proxy for reactive control, not a closed-loop controller and not evidence of quantum advantage. The paper extends the group’s earlier quantum planner (</w:t>
       </w:r>
       <w:r>
         <w:t xml:space="preserve">(Chella et al. 2022)</w:t>

</xml_diff>